<commit_message>
Screenshots and Evaluation files
</commit_message>
<xml_diff>
--- a/Evaluation/TechPrime_AI_IT_Expert_Evaluation_Guide.docx
+++ b/Evaluation/TechPrime_AI_IT_Expert_Evaluation_Guide.docx
@@ -15,7 +15,27 @@
           <w:sz w:val="44"/>
           <w:szCs w:val="44"/>
         </w:rPr>
-        <w:t>IT EXPERT EVALUATION GUIDE</w:t>
+        <w:t>IT EXPERT</w:t>
+      </w:r>
+      <w:r>
+        <w:rPr>
+          <w:b/>
+          <w:bCs/>
+          <w:color w:val="2E5E18"/>
+          <w:sz w:val="44"/>
+          <w:szCs w:val="44"/>
+        </w:rPr>
+        <w:t xml:space="preserve"> and EASYPC STAFFS</w:t>
+      </w:r>
+      <w:r>
+        <w:rPr>
+          <w:b/>
+          <w:bCs/>
+          <w:color w:val="2E5E18"/>
+          <w:sz w:val="44"/>
+          <w:szCs w:val="44"/>
+        </w:rPr>
+        <w:t xml:space="preserve"> EVALUATION GUIDE</w:t>
       </w:r>
     </w:p>
     <w:p>
@@ -230,7 +250,37 @@
                 <w:sz w:val="20"/>
                 <w:szCs w:val="20"/>
               </w:rPr>
-              <w:t>IT Expert Evaluation</w:t>
+              <w:t xml:space="preserve">IT Expert </w:t>
+            </w:r>
+            <w:r>
+              <w:rPr>
+                <w:sz w:val="20"/>
+                <w:szCs w:val="20"/>
+              </w:rPr>
+              <w:t xml:space="preserve">and </w:t>
+            </w:r>
+            <w:proofErr w:type="spellStart"/>
+            <w:r>
+              <w:rPr>
+                <w:sz w:val="20"/>
+                <w:szCs w:val="20"/>
+              </w:rPr>
+              <w:t>EasyPC</w:t>
+            </w:r>
+            <w:proofErr w:type="spellEnd"/>
+            <w:r>
+              <w:rPr>
+                <w:sz w:val="20"/>
+                <w:szCs w:val="20"/>
+              </w:rPr>
+              <w:t xml:space="preserve"> Staffs </w:t>
+            </w:r>
+            <w:r>
+              <w:rPr>
+                <w:sz w:val="20"/>
+                <w:szCs w:val="20"/>
+              </w:rPr>
+              <w:t>Evaluation</w:t>
             </w:r>
           </w:p>
         </w:tc>
@@ -812,21 +862,7 @@
                 <w:sz w:val="20"/>
                 <w:szCs w:val="20"/>
               </w:rPr>
-              <w:t xml:space="preserve">Dashboard, Forecast, Manage Users, </w:t>
-            </w:r>
-            <w:r>
-              <w:rPr>
-                <w:sz w:val="20"/>
-                <w:szCs w:val="20"/>
-              </w:rPr>
-              <w:t>Messages</w:t>
-            </w:r>
-            <w:r>
-              <w:rPr>
-                <w:sz w:val="20"/>
-                <w:szCs w:val="20"/>
-              </w:rPr>
-              <w:t>, Settings</w:t>
+              <w:t>Dashboard, Forecast, Manage Users, Activity Logs, Messages, Settings</w:t>
             </w:r>
           </w:p>
         </w:tc>
@@ -929,28 +965,7 @@
                 <w:sz w:val="20"/>
                 <w:szCs w:val="20"/>
               </w:rPr>
-              <w:t>Sales Dashboard</w:t>
-            </w:r>
-            <w:r>
-              <w:rPr>
-                <w:sz w:val="20"/>
-                <w:szCs w:val="20"/>
-              </w:rPr>
-              <w:t xml:space="preserve">, </w:t>
-            </w:r>
-            <w:r>
-              <w:rPr>
-                <w:sz w:val="20"/>
-                <w:szCs w:val="20"/>
-              </w:rPr>
-              <w:t>Forecasts, Delivery History, Reports Export</w:t>
-            </w:r>
-            <w:r>
-              <w:rPr>
-                <w:sz w:val="20"/>
-                <w:szCs w:val="20"/>
-              </w:rPr>
-              <w:t>, Messages</w:t>
+              <w:t>Dashboard, History, Forecast, Print / Export (CSV, Excel, PDF), Messages</w:t>
             </w:r>
           </w:p>
         </w:tc>
@@ -1049,7 +1064,7 @@
                 <w:sz w:val="20"/>
                 <w:szCs w:val="20"/>
               </w:rPr>
-              <w:t>Orders, Stocks [Inventory &amp; Add New Product], Forecast, Messages</w:t>
+              <w:t>Orders, Stocks (Inventory &amp; Add New Product), Forecast, Reviews, Messages</w:t>
             </w:r>
           </w:p>
         </w:tc>
@@ -1127,17 +1142,8 @@
                 <w:sz w:val="20"/>
                 <w:szCs w:val="20"/>
               </w:rPr>
-              <w:t>Hello</w:t>
-            </w:r>
-            <w:proofErr w:type="gramStart"/>
-            <w:r>
-              <w:rPr>
-                <w:sz w:val="20"/>
-                <w:szCs w:val="20"/>
-              </w:rPr>
-              <w:t>123..</w:t>
-            </w:r>
-            <w:proofErr w:type="gramEnd"/>
+              <w:t>Hello123..</w:t>
+            </w:r>
           </w:p>
         </w:tc>
         <w:tc>
@@ -1260,7 +1266,7 @@
                 <w:sz w:val="20"/>
                 <w:szCs w:val="20"/>
               </w:rPr>
-              <w:t>Shop, Primo AI Assistant, Build a PC, Cart and Checkout</w:t>
+              <w:t>Shop, Primo AI Assistant, Build a PC, Cart and Checkout, Product Review</w:t>
             </w:r>
           </w:p>
         </w:tc>
@@ -1568,8 +1574,6 @@
             </w:pPr>
             <w:r>
               <w:rPr>
-                <w:b/>
-                <w:bCs/>
                 <w:sz w:val="20"/>
                 <w:szCs w:val="20"/>
               </w:rPr>
@@ -1664,45 +1668,43 @@
             </w:pPr>
             <w:r>
               <w:rPr>
+                <w:sz w:val="20"/>
+                <w:szCs w:val="20"/>
+              </w:rPr>
+              <w:t>Admin</w:t>
+            </w:r>
+          </w:p>
+        </w:tc>
+        <w:tc>
+          <w:tcPr>
+            <w:tcW w:w="4300" w:type="dxa"/>
+            <w:shd w:val="clear" w:color="auto" w:fill="F8FBF5"/>
+            <w:tcMar>
+              <w:top w:w="80" w:type="dxa"/>
+              <w:left w:w="120" w:type="dxa"/>
+              <w:bottom w:w="80" w:type="dxa"/>
+              <w:right w:w="120" w:type="dxa"/>
+            </w:tcMar>
+            <w:vAlign w:val="center"/>
+          </w:tcPr>
+          <w:p>
+            <w:pPr>
+              <w:spacing w:after="20"/>
+            </w:pPr>
+            <w:r>
+              <w:rPr>
+                <w:sz w:val="20"/>
+                <w:szCs w:val="20"/>
+              </w:rPr>
+              <w:t xml:space="preserve">Open </w:t>
+            </w:r>
+            <w:r>
+              <w:rPr>
                 <w:b/>
                 <w:bCs/>
                 <w:sz w:val="20"/>
                 <w:szCs w:val="20"/>
               </w:rPr>
-              <w:t>Admin</w:t>
-            </w:r>
-          </w:p>
-        </w:tc>
-        <w:tc>
-          <w:tcPr>
-            <w:tcW w:w="4300" w:type="dxa"/>
-            <w:shd w:val="clear" w:color="auto" w:fill="F8FBF5"/>
-            <w:tcMar>
-              <w:top w:w="80" w:type="dxa"/>
-              <w:left w:w="120" w:type="dxa"/>
-              <w:bottom w:w="80" w:type="dxa"/>
-              <w:right w:w="120" w:type="dxa"/>
-            </w:tcMar>
-            <w:vAlign w:val="center"/>
-          </w:tcPr>
-          <w:p>
-            <w:pPr>
-              <w:spacing w:after="20"/>
-            </w:pPr>
-            <w:r>
-              <w:rPr>
-                <w:sz w:val="20"/>
-                <w:szCs w:val="20"/>
-              </w:rPr>
-              <w:t xml:space="preserve">Open </w:t>
-            </w:r>
-            <w:r>
-              <w:rPr>
-                <w:b/>
-                <w:bCs/>
-                <w:sz w:val="20"/>
-                <w:szCs w:val="20"/>
-              </w:rPr>
               <w:t>Activity Logs</w:t>
             </w:r>
             <w:r>
@@ -1710,7 +1712,7 @@
                 <w:sz w:val="20"/>
                 <w:szCs w:val="20"/>
               </w:rPr>
-              <w:t xml:space="preserve"> after logging in.</w:t>
+              <w:t>, search for your email and change the rows per page.</w:t>
             </w:r>
           </w:p>
         </w:tc>
@@ -1735,7 +1737,7 @@
                 <w:sz w:val="20"/>
                 <w:szCs w:val="20"/>
               </w:rPr>
-              <w:t>Your login shows with time, role and action.</w:t>
+              <w:t>Your login shows with time, role, action and IP address; results page 25 / 50 / 100 at a time.</w:t>
             </w:r>
           </w:p>
         </w:tc>
@@ -1761,8 +1763,6 @@
             </w:pPr>
             <w:r>
               <w:rPr>
-                <w:b/>
-                <w:bCs/>
                 <w:sz w:val="20"/>
                 <w:szCs w:val="20"/>
               </w:rPr>
@@ -1857,53 +1857,51 @@
             </w:pPr>
             <w:r>
               <w:rPr>
+                <w:sz w:val="20"/>
+                <w:szCs w:val="20"/>
+              </w:rPr>
+              <w:t>Admin</w:t>
+            </w:r>
+          </w:p>
+        </w:tc>
+        <w:tc>
+          <w:tcPr>
+            <w:tcW w:w="4300" w:type="dxa"/>
+            <w:shd w:val="clear" w:color="auto" w:fill="F8FBF5"/>
+            <w:tcMar>
+              <w:top w:w="80" w:type="dxa"/>
+              <w:left w:w="120" w:type="dxa"/>
+              <w:bottom w:w="80" w:type="dxa"/>
+              <w:right w:w="120" w:type="dxa"/>
+            </w:tcMar>
+            <w:vAlign w:val="center"/>
+          </w:tcPr>
+          <w:p>
+            <w:pPr>
+              <w:spacing w:after="20"/>
+            </w:pPr>
+            <w:r>
+              <w:rPr>
+                <w:sz w:val="20"/>
+                <w:szCs w:val="20"/>
+              </w:rPr>
+              <w:t xml:space="preserve">Click </w:t>
+            </w:r>
+            <w:r>
+              <w:rPr>
                 <w:b/>
                 <w:bCs/>
                 <w:sz w:val="20"/>
                 <w:szCs w:val="20"/>
               </w:rPr>
-              <w:t>Retail Officer</w:t>
-            </w:r>
-          </w:p>
-        </w:tc>
-        <w:tc>
-          <w:tcPr>
-            <w:tcW w:w="4300" w:type="dxa"/>
-            <w:shd w:val="clear" w:color="auto" w:fill="F8FBF5"/>
-            <w:tcMar>
-              <w:top w:w="80" w:type="dxa"/>
-              <w:left w:w="120" w:type="dxa"/>
-              <w:bottom w:w="80" w:type="dxa"/>
-              <w:right w:w="120" w:type="dxa"/>
-            </w:tcMar>
-            <w:vAlign w:val="center"/>
-          </w:tcPr>
-          <w:p>
-            <w:pPr>
-              <w:spacing w:after="20"/>
-            </w:pPr>
-            <w:r>
-              <w:rPr>
-                <w:sz w:val="20"/>
-                <w:szCs w:val="20"/>
-              </w:rPr>
-              <w:t xml:space="preserve">Export the </w:t>
-            </w:r>
-            <w:r>
-              <w:rPr>
-                <w:b/>
-                <w:bCs/>
-                <w:sz w:val="20"/>
-                <w:szCs w:val="20"/>
-              </w:rPr>
-              <w:t>Monthly Sales Report</w:t>
-            </w:r>
-            <w:r>
-              <w:rPr>
-                <w:sz w:val="20"/>
-                <w:szCs w:val="20"/>
-              </w:rPr>
-              <w:t xml:space="preserve"> (CSV / PDF).</w:t>
+              <w:t>Print</w:t>
+            </w:r>
+            <w:r>
+              <w:rPr>
+                <w:sz w:val="20"/>
+                <w:szCs w:val="20"/>
+              </w:rPr>
+              <w:t xml:space="preserve"> on the Dashboard.</w:t>
             </w:r>
           </w:p>
         </w:tc>
@@ -1928,7 +1926,7 @@
                 <w:sz w:val="20"/>
                 <w:szCs w:val="20"/>
               </w:rPr>
-              <w:t>The file downloads with the table data.</w:t>
+              <w:t>A print layout opens with logo, title, date range and prepared-by; menus are hidden.</w:t>
             </w:r>
           </w:p>
         </w:tc>
@@ -1954,36 +1952,50 @@
             </w:pPr>
             <w:r>
               <w:rPr>
+                <w:sz w:val="20"/>
+                <w:szCs w:val="20"/>
+              </w:rPr>
+              <w:t>Retail Officer</w:t>
+            </w:r>
+          </w:p>
+        </w:tc>
+        <w:tc>
+          <w:tcPr>
+            <w:tcW w:w="4300" w:type="dxa"/>
+            <w:tcMar>
+              <w:top w:w="80" w:type="dxa"/>
+              <w:left w:w="120" w:type="dxa"/>
+              <w:bottom w:w="80" w:type="dxa"/>
+              <w:right w:w="120" w:type="dxa"/>
+            </w:tcMar>
+            <w:vAlign w:val="center"/>
+          </w:tcPr>
+          <w:p>
+            <w:pPr>
+              <w:spacing w:after="20"/>
+            </w:pPr>
+            <w:r>
+              <w:rPr>
+                <w:sz w:val="20"/>
+                <w:szCs w:val="20"/>
+              </w:rPr>
+              <w:t xml:space="preserve">On the </w:t>
+            </w:r>
+            <w:r>
+              <w:rPr>
                 <w:b/>
                 <w:bCs/>
                 <w:sz w:val="20"/>
                 <w:szCs w:val="20"/>
               </w:rPr>
-              <w:t>Retail Officer</w:t>
-            </w:r>
-          </w:p>
-        </w:tc>
-        <w:tc>
-          <w:tcPr>
-            <w:tcW w:w="4300" w:type="dxa"/>
-            <w:tcMar>
-              <w:top w:w="80" w:type="dxa"/>
-              <w:left w:w="120" w:type="dxa"/>
-              <w:bottom w:w="80" w:type="dxa"/>
-              <w:right w:w="120" w:type="dxa"/>
-            </w:tcMar>
-            <w:vAlign w:val="center"/>
-          </w:tcPr>
-          <w:p>
-            <w:pPr>
-              <w:spacing w:after="20"/>
-            </w:pPr>
-            <w:r>
-              <w:rPr>
-                <w:sz w:val="20"/>
-                <w:szCs w:val="20"/>
-              </w:rPr>
-              <w:t xml:space="preserve">Filter </w:t>
+              <w:t>Dashboard</w:t>
+            </w:r>
+            <w:r>
+              <w:rPr>
+                <w:sz w:val="20"/>
+                <w:szCs w:val="20"/>
+              </w:rPr>
+              <w:t xml:space="preserve">, click </w:t>
             </w:r>
             <w:r>
               <w:rPr>
@@ -1992,14 +2004,30 @@
                 <w:sz w:val="20"/>
                 <w:szCs w:val="20"/>
               </w:rPr>
-              <w:t>Delivery History</w:t>
-            </w:r>
-            <w:r>
-              <w:rPr>
-                <w:sz w:val="20"/>
-                <w:szCs w:val="20"/>
-              </w:rPr>
-              <w:t xml:space="preserve"> by date range.</w:t>
+              <w:t>Export PDF</w:t>
+            </w:r>
+            <w:r>
+              <w:rPr>
+                <w:sz w:val="20"/>
+                <w:szCs w:val="20"/>
+              </w:rPr>
+              <w:t xml:space="preserve"> (or </w:t>
+            </w:r>
+            <w:r>
+              <w:rPr>
+                <w:b/>
+                <w:bCs/>
+                <w:sz w:val="20"/>
+                <w:szCs w:val="20"/>
+              </w:rPr>
+              <w:t>Export CSV</w:t>
+            </w:r>
+            <w:r>
+              <w:rPr>
+                <w:sz w:val="20"/>
+                <w:szCs w:val="20"/>
+              </w:rPr>
+              <w:t>).</w:t>
             </w:r>
           </w:p>
         </w:tc>
@@ -2023,7 +2051,7 @@
                 <w:sz w:val="20"/>
                 <w:szCs w:val="20"/>
               </w:rPr>
-              <w:t>Totals, chart and table update.</w:t>
+              <w:t>A PDF report (or CSV file) downloads with the summary, monthly sales and sales by category.</w:t>
             </w:r>
           </w:p>
         </w:tc>
@@ -2050,37 +2078,51 @@
             </w:pPr>
             <w:r>
               <w:rPr>
+                <w:sz w:val="20"/>
+                <w:szCs w:val="20"/>
+              </w:rPr>
+              <w:t>Retail Officer</w:t>
+            </w:r>
+          </w:p>
+        </w:tc>
+        <w:tc>
+          <w:tcPr>
+            <w:tcW w:w="4300" w:type="dxa"/>
+            <w:shd w:val="clear" w:color="auto" w:fill="F8FBF5"/>
+            <w:tcMar>
+              <w:top w:w="80" w:type="dxa"/>
+              <w:left w:w="120" w:type="dxa"/>
+              <w:bottom w:w="80" w:type="dxa"/>
+              <w:right w:w="120" w:type="dxa"/>
+            </w:tcMar>
+            <w:vAlign w:val="center"/>
+          </w:tcPr>
+          <w:p>
+            <w:pPr>
+              <w:spacing w:after="20"/>
+            </w:pPr>
+            <w:r>
+              <w:rPr>
+                <w:sz w:val="20"/>
+                <w:szCs w:val="20"/>
+              </w:rPr>
+              <w:t xml:space="preserve">In </w:t>
+            </w:r>
+            <w:r>
+              <w:rPr>
                 <w:b/>
                 <w:bCs/>
                 <w:sz w:val="20"/>
                 <w:szCs w:val="20"/>
               </w:rPr>
-              <w:t>Inventory Custodian</w:t>
-            </w:r>
-          </w:p>
-        </w:tc>
-        <w:tc>
-          <w:tcPr>
-            <w:tcW w:w="4300" w:type="dxa"/>
-            <w:shd w:val="clear" w:color="auto" w:fill="F8FBF5"/>
-            <w:tcMar>
-              <w:top w:w="80" w:type="dxa"/>
-              <w:left w:w="120" w:type="dxa"/>
-              <w:bottom w:w="80" w:type="dxa"/>
-              <w:right w:w="120" w:type="dxa"/>
-            </w:tcMar>
-            <w:vAlign w:val="center"/>
-          </w:tcPr>
-          <w:p>
-            <w:pPr>
-              <w:spacing w:after="20"/>
-            </w:pPr>
-            <w:r>
-              <w:rPr>
-                <w:sz w:val="20"/>
-                <w:szCs w:val="20"/>
-              </w:rPr>
-              <w:t xml:space="preserve">In </w:t>
+              <w:t>History</w:t>
+            </w:r>
+            <w:r>
+              <w:rPr>
+                <w:sz w:val="20"/>
+                <w:szCs w:val="20"/>
+              </w:rPr>
+              <w:t xml:space="preserve">, choose a period or date range, then click </w:t>
             </w:r>
             <w:r>
               <w:rPr>
@@ -2089,30 +2131,14 @@
                 <w:sz w:val="20"/>
                 <w:szCs w:val="20"/>
               </w:rPr>
-              <w:t>Stock In</w:t>
-            </w:r>
-            <w:r>
-              <w:rPr>
-                <w:sz w:val="20"/>
-                <w:szCs w:val="20"/>
-              </w:rPr>
-              <w:t xml:space="preserve">, scan or type test barcode </w:t>
-            </w:r>
-            <w:r>
-              <w:rPr>
-                <w:b/>
-                <w:bCs/>
-                <w:sz w:val="20"/>
-                <w:szCs w:val="20"/>
-              </w:rPr>
-              <w:t>400000000015</w:t>
-            </w:r>
-            <w:r>
-              <w:rPr>
-                <w:sz w:val="20"/>
-                <w:szCs w:val="20"/>
-              </w:rPr>
-              <w:t>, pick a supplier, confirm.</w:t>
+              <w:t>Export Excel</w:t>
+            </w:r>
+            <w:r>
+              <w:rPr>
+                <w:sz w:val="20"/>
+                <w:szCs w:val="20"/>
+              </w:rPr>
+              <w:t>.</w:t>
             </w:r>
           </w:p>
         </w:tc>
@@ -2137,7 +2163,7 @@
                 <w:sz w:val="20"/>
                 <w:szCs w:val="20"/>
               </w:rPr>
-              <w:t>Stock increases; entry shows in Recent Stock-Ins and Activity.</w:t>
+              <w:t>Totals and table update; an .xlsx file downloads with Summary, Deliveries and Items sheets.</w:t>
             </w:r>
           </w:p>
         </w:tc>
@@ -2163,36 +2189,50 @@
             </w:pPr>
             <w:r>
               <w:rPr>
+                <w:sz w:val="20"/>
+                <w:szCs w:val="20"/>
+              </w:rPr>
+              <w:t>Inventory Custodian</w:t>
+            </w:r>
+          </w:p>
+        </w:tc>
+        <w:tc>
+          <w:tcPr>
+            <w:tcW w:w="4300" w:type="dxa"/>
+            <w:tcMar>
+              <w:top w:w="80" w:type="dxa"/>
+              <w:left w:w="120" w:type="dxa"/>
+              <w:bottom w:w="80" w:type="dxa"/>
+              <w:right w:w="120" w:type="dxa"/>
+            </w:tcMar>
+            <w:vAlign w:val="center"/>
+          </w:tcPr>
+          <w:p>
+            <w:pPr>
+              <w:spacing w:after="20"/>
+            </w:pPr>
+            <w:r>
+              <w:rPr>
+                <w:sz w:val="20"/>
+                <w:szCs w:val="20"/>
+              </w:rPr>
+              <w:t xml:space="preserve">In </w:t>
+            </w:r>
+            <w:r>
+              <w:rPr>
                 <w:b/>
                 <w:bCs/>
                 <w:sz w:val="20"/>
                 <w:szCs w:val="20"/>
               </w:rPr>
-              <w:t>Inventory Custodian</w:t>
-            </w:r>
-          </w:p>
-        </w:tc>
-        <w:tc>
-          <w:tcPr>
-            <w:tcW w:w="4300" w:type="dxa"/>
-            <w:tcMar>
-              <w:top w:w="80" w:type="dxa"/>
-              <w:left w:w="120" w:type="dxa"/>
-              <w:bottom w:w="80" w:type="dxa"/>
-              <w:right w:w="120" w:type="dxa"/>
-            </w:tcMar>
-            <w:vAlign w:val="center"/>
-          </w:tcPr>
-          <w:p>
-            <w:pPr>
-              <w:spacing w:after="20"/>
-            </w:pPr>
-            <w:r>
-              <w:rPr>
-                <w:sz w:val="20"/>
-                <w:szCs w:val="20"/>
-              </w:rPr>
-              <w:t xml:space="preserve">In </w:t>
+              <w:t>Stocks → Add New Product</w:t>
+            </w:r>
+            <w:r>
+              <w:rPr>
+                <w:sz w:val="20"/>
+                <w:szCs w:val="20"/>
+              </w:rPr>
+              <w:t xml:space="preserve">, scan or type test barcode </w:t>
             </w:r>
             <w:r>
               <w:rPr>
@@ -2201,14 +2241,14 @@
                 <w:sz w:val="20"/>
                 <w:szCs w:val="20"/>
               </w:rPr>
-              <w:t>Orders</w:t>
-            </w:r>
-            <w:r>
-              <w:rPr>
-                <w:sz w:val="20"/>
-                <w:szCs w:val="20"/>
-              </w:rPr>
-              <w:t>, accept a pending order and update its status.</w:t>
+              <w:t>400000000015</w:t>
+            </w:r>
+            <w:r>
+              <w:rPr>
+                <w:sz w:val="20"/>
+                <w:szCs w:val="20"/>
+              </w:rPr>
+              <w:t>, pick a supplier, confirm.</w:t>
             </w:r>
           </w:p>
         </w:tc>
@@ -2232,7 +2272,7 @@
                 <w:sz w:val="20"/>
                 <w:szCs w:val="20"/>
               </w:rPr>
-              <w:t>Status changes; the client gets a notification.</w:t>
+              <w:t>Stock increases; the entry shows in My Recent Stock-Ins and Activity.</w:t>
             </w:r>
           </w:p>
         </w:tc>
@@ -2259,69 +2299,51 @@
             </w:pPr>
             <w:r>
               <w:rPr>
+                <w:sz w:val="20"/>
+                <w:szCs w:val="20"/>
+              </w:rPr>
+              <w:t>Inventory Custodian</w:t>
+            </w:r>
+          </w:p>
+        </w:tc>
+        <w:tc>
+          <w:tcPr>
+            <w:tcW w:w="4300" w:type="dxa"/>
+            <w:shd w:val="clear" w:color="auto" w:fill="F8FBF5"/>
+            <w:tcMar>
+              <w:top w:w="80" w:type="dxa"/>
+              <w:left w:w="120" w:type="dxa"/>
+              <w:bottom w:w="80" w:type="dxa"/>
+              <w:right w:w="120" w:type="dxa"/>
+            </w:tcMar>
+            <w:vAlign w:val="center"/>
+          </w:tcPr>
+          <w:p>
+            <w:pPr>
+              <w:spacing w:after="20"/>
+            </w:pPr>
+            <w:r>
+              <w:rPr>
+                <w:sz w:val="20"/>
+                <w:szCs w:val="20"/>
+              </w:rPr>
+              <w:t xml:space="preserve">In </w:t>
+            </w:r>
+            <w:r>
+              <w:rPr>
                 <w:b/>
                 <w:bCs/>
                 <w:sz w:val="20"/>
                 <w:szCs w:val="20"/>
               </w:rPr>
-              <w:t>Cashier</w:t>
-            </w:r>
-          </w:p>
-        </w:tc>
-        <w:tc>
-          <w:tcPr>
-            <w:tcW w:w="4300" w:type="dxa"/>
-            <w:shd w:val="clear" w:color="auto" w:fill="F8FBF5"/>
-            <w:tcMar>
-              <w:top w:w="80" w:type="dxa"/>
-              <w:left w:w="120" w:type="dxa"/>
-              <w:bottom w:w="80" w:type="dxa"/>
-              <w:right w:w="120" w:type="dxa"/>
-            </w:tcMar>
-            <w:vAlign w:val="center"/>
-          </w:tcPr>
-          <w:p>
-            <w:pPr>
-              <w:spacing w:after="20"/>
-            </w:pPr>
-            <w:r>
-              <w:rPr>
-                <w:sz w:val="20"/>
-                <w:szCs w:val="20"/>
-              </w:rPr>
-              <w:t xml:space="preserve">In </w:t>
-            </w:r>
-            <w:r>
-              <w:rPr>
-                <w:b/>
-                <w:bCs/>
-                <w:sz w:val="20"/>
-                <w:szCs w:val="20"/>
-              </w:rPr>
-              <w:t>POS Checkout</w:t>
-            </w:r>
-            <w:r>
-              <w:rPr>
-                <w:sz w:val="20"/>
-                <w:szCs w:val="20"/>
-              </w:rPr>
-              <w:t xml:space="preserve">, scan or type </w:t>
-            </w:r>
-            <w:r>
-              <w:rPr>
-                <w:b/>
-                <w:bCs/>
-                <w:sz w:val="20"/>
-                <w:szCs w:val="20"/>
-              </w:rPr>
-              <w:t>400000000015</w:t>
-            </w:r>
-            <w:r>
-              <w:rPr>
-                <w:sz w:val="20"/>
-                <w:szCs w:val="20"/>
-              </w:rPr>
-              <w:t>, then check out.</w:t>
+              <w:t>Orders</w:t>
+            </w:r>
+            <w:r>
+              <w:rPr>
+                <w:sz w:val="20"/>
+                <w:szCs w:val="20"/>
+              </w:rPr>
+              <w:t>, accept a pending order and update its status.</w:t>
             </w:r>
           </w:p>
         </w:tc>
@@ -2346,7 +2368,7 @@
                 <w:sz w:val="20"/>
                 <w:szCs w:val="20"/>
               </w:rPr>
-              <w:t>Receipt shows VAT breakdown and change; stock decreases.</w:t>
+              <w:t>Status changes; the client gets a notification.</w:t>
             </w:r>
           </w:p>
         </w:tc>
@@ -2372,52 +2394,50 @@
             </w:pPr>
             <w:r>
               <w:rPr>
+                <w:sz w:val="20"/>
+                <w:szCs w:val="20"/>
+              </w:rPr>
+              <w:t>Inventory Custodian</w:t>
+            </w:r>
+          </w:p>
+        </w:tc>
+        <w:tc>
+          <w:tcPr>
+            <w:tcW w:w="4300" w:type="dxa"/>
+            <w:tcMar>
+              <w:top w:w="80" w:type="dxa"/>
+              <w:left w:w="120" w:type="dxa"/>
+              <w:bottom w:w="80" w:type="dxa"/>
+              <w:right w:w="120" w:type="dxa"/>
+            </w:tcMar>
+            <w:vAlign w:val="center"/>
+          </w:tcPr>
+          <w:p>
+            <w:pPr>
+              <w:spacing w:after="20"/>
+            </w:pPr>
+            <w:r>
+              <w:rPr>
+                <w:sz w:val="20"/>
+                <w:szCs w:val="20"/>
+              </w:rPr>
+              <w:t xml:space="preserve">In </w:t>
+            </w:r>
+            <w:r>
+              <w:rPr>
                 <w:b/>
                 <w:bCs/>
                 <w:sz w:val="20"/>
                 <w:szCs w:val="20"/>
               </w:rPr>
-              <w:t>Client</w:t>
-            </w:r>
-          </w:p>
-        </w:tc>
-        <w:tc>
-          <w:tcPr>
-            <w:tcW w:w="4300" w:type="dxa"/>
-            <w:tcMar>
-              <w:top w:w="80" w:type="dxa"/>
-              <w:left w:w="120" w:type="dxa"/>
-              <w:bottom w:w="80" w:type="dxa"/>
-              <w:right w:w="120" w:type="dxa"/>
-            </w:tcMar>
-            <w:vAlign w:val="center"/>
-          </w:tcPr>
-          <w:p>
-            <w:pPr>
-              <w:spacing w:after="20"/>
-            </w:pPr>
-            <w:r>
-              <w:rPr>
-                <w:sz w:val="20"/>
-                <w:szCs w:val="20"/>
-              </w:rPr>
-              <w:t xml:space="preserve">Ask </w:t>
-            </w:r>
-            <w:r>
-              <w:rPr>
-                <w:b/>
-                <w:bCs/>
-                <w:sz w:val="20"/>
-                <w:szCs w:val="20"/>
-              </w:rPr>
-              <w:t>Primo</w:t>
-            </w:r>
-            <w:r>
-              <w:rPr>
-                <w:sz w:val="20"/>
-                <w:szCs w:val="20"/>
-              </w:rPr>
-              <w:t xml:space="preserve"> for a product (e.g. “gaming laptop”).</w:t>
+              <w:t>Reviews</w:t>
+            </w:r>
+            <w:r>
+              <w:rPr>
+                <w:sz w:val="20"/>
+                <w:szCs w:val="20"/>
+              </w:rPr>
+              <w:t>, reply to a client review.</w:t>
             </w:r>
           </w:p>
         </w:tc>
@@ -2441,7 +2461,7 @@
                 <w:sz w:val="20"/>
                 <w:szCs w:val="20"/>
               </w:rPr>
-              <w:t>Primo replies with matching product cards.</w:t>
+              <w:t>The reply is saved and shows under the review for the client.</w:t>
             </w:r>
           </w:p>
         </w:tc>
@@ -2468,37 +2488,51 @@
             </w:pPr>
             <w:r>
               <w:rPr>
+                <w:sz w:val="20"/>
+                <w:szCs w:val="20"/>
+              </w:rPr>
+              <w:t>Cashier</w:t>
+            </w:r>
+          </w:p>
+        </w:tc>
+        <w:tc>
+          <w:tcPr>
+            <w:tcW w:w="4300" w:type="dxa"/>
+            <w:shd w:val="clear" w:color="auto" w:fill="F8FBF5"/>
+            <w:tcMar>
+              <w:top w:w="80" w:type="dxa"/>
+              <w:left w:w="120" w:type="dxa"/>
+              <w:bottom w:w="80" w:type="dxa"/>
+              <w:right w:w="120" w:type="dxa"/>
+            </w:tcMar>
+            <w:vAlign w:val="center"/>
+          </w:tcPr>
+          <w:p>
+            <w:pPr>
+              <w:spacing w:after="20"/>
+            </w:pPr>
+            <w:r>
+              <w:rPr>
+                <w:sz w:val="20"/>
+                <w:szCs w:val="20"/>
+              </w:rPr>
+              <w:t xml:space="preserve">In </w:t>
+            </w:r>
+            <w:r>
+              <w:rPr>
                 <w:b/>
                 <w:bCs/>
                 <w:sz w:val="20"/>
                 <w:szCs w:val="20"/>
               </w:rPr>
-              <w:t>Client</w:t>
-            </w:r>
-          </w:p>
-        </w:tc>
-        <w:tc>
-          <w:tcPr>
-            <w:tcW w:w="4300" w:type="dxa"/>
-            <w:shd w:val="clear" w:color="auto" w:fill="F8FBF5"/>
-            <w:tcMar>
-              <w:top w:w="80" w:type="dxa"/>
-              <w:left w:w="120" w:type="dxa"/>
-              <w:bottom w:w="80" w:type="dxa"/>
-              <w:right w:w="120" w:type="dxa"/>
-            </w:tcMar>
-            <w:vAlign w:val="center"/>
-          </w:tcPr>
-          <w:p>
-            <w:pPr>
-              <w:spacing w:after="20"/>
-            </w:pPr>
-            <w:r>
-              <w:rPr>
-                <w:sz w:val="20"/>
-                <w:szCs w:val="20"/>
-              </w:rPr>
-              <w:t xml:space="preserve">In </w:t>
+              <w:t>POS Checkout</w:t>
+            </w:r>
+            <w:r>
+              <w:rPr>
+                <w:sz w:val="20"/>
+                <w:szCs w:val="20"/>
+              </w:rPr>
+              <w:t xml:space="preserve">, scan or type </w:t>
             </w:r>
             <w:r>
               <w:rPr>
@@ -2507,14 +2541,14 @@
                 <w:sz w:val="20"/>
                 <w:szCs w:val="20"/>
               </w:rPr>
-              <w:t>Build a PC</w:t>
-            </w:r>
-            <w:r>
-              <w:rPr>
-                <w:sz w:val="20"/>
-                <w:szCs w:val="20"/>
-              </w:rPr>
-              <w:t>, pick a processor and motherboard.</w:t>
+              <w:t>400000000015</w:t>
+            </w:r>
+            <w:r>
+              <w:rPr>
+                <w:sz w:val="20"/>
+                <w:szCs w:val="20"/>
+              </w:rPr>
+              <w:t>, then check out.</w:t>
             </w:r>
           </w:p>
         </w:tc>
@@ -2539,7 +2573,7 @@
                 <w:sz w:val="20"/>
                 <w:szCs w:val="20"/>
               </w:rPr>
-              <w:t>Compatibility, build score and total update.</w:t>
+              <w:t>Receipt shows VAT breakdown and change; stock decreases.</w:t>
             </w:r>
           </w:p>
         </w:tc>
@@ -2565,52 +2599,50 @@
             </w:pPr>
             <w:r>
               <w:rPr>
+                <w:sz w:val="20"/>
+                <w:szCs w:val="20"/>
+              </w:rPr>
+              <w:t>Client</w:t>
+            </w:r>
+          </w:p>
+        </w:tc>
+        <w:tc>
+          <w:tcPr>
+            <w:tcW w:w="4300" w:type="dxa"/>
+            <w:tcMar>
+              <w:top w:w="80" w:type="dxa"/>
+              <w:left w:w="120" w:type="dxa"/>
+              <w:bottom w:w="80" w:type="dxa"/>
+              <w:right w:w="120" w:type="dxa"/>
+            </w:tcMar>
+            <w:vAlign w:val="center"/>
+          </w:tcPr>
+          <w:p>
+            <w:pPr>
+              <w:spacing w:after="20"/>
+            </w:pPr>
+            <w:r>
+              <w:rPr>
+                <w:sz w:val="20"/>
+                <w:szCs w:val="20"/>
+              </w:rPr>
+              <w:t xml:space="preserve">Ask </w:t>
+            </w:r>
+            <w:r>
+              <w:rPr>
                 <w:b/>
                 <w:bCs/>
                 <w:sz w:val="20"/>
                 <w:szCs w:val="20"/>
               </w:rPr>
-              <w:t>Client</w:t>
-            </w:r>
-          </w:p>
-        </w:tc>
-        <w:tc>
-          <w:tcPr>
-            <w:tcW w:w="4300" w:type="dxa"/>
-            <w:tcMar>
-              <w:top w:w="80" w:type="dxa"/>
-              <w:left w:w="120" w:type="dxa"/>
-              <w:bottom w:w="80" w:type="dxa"/>
-              <w:right w:w="120" w:type="dxa"/>
-            </w:tcMar>
-            <w:vAlign w:val="center"/>
-          </w:tcPr>
-          <w:p>
-            <w:pPr>
-              <w:spacing w:after="20"/>
-            </w:pPr>
-            <w:r>
-              <w:rPr>
-                <w:sz w:val="20"/>
-                <w:szCs w:val="20"/>
-              </w:rPr>
-              <w:t xml:space="preserve">Add an item to the cart and </w:t>
-            </w:r>
-            <w:r>
-              <w:rPr>
-                <w:b/>
-                <w:bCs/>
-                <w:sz w:val="20"/>
-                <w:szCs w:val="20"/>
-              </w:rPr>
-              <w:t>check out</w:t>
-            </w:r>
-            <w:r>
-              <w:rPr>
-                <w:sz w:val="20"/>
-                <w:szCs w:val="20"/>
-              </w:rPr>
-              <w:t xml:space="preserve"> (Pick Up).</w:t>
+              <w:t>Primo</w:t>
+            </w:r>
+            <w:r>
+              <w:rPr>
+                <w:sz w:val="20"/>
+                <w:szCs w:val="20"/>
+              </w:rPr>
+              <w:t xml:space="preserve"> for a product (e.g. “gaming laptop”), then ask an off-topic question (e.g. homework).</w:t>
             </w:r>
           </w:p>
         </w:tc>
@@ -2634,7 +2666,7 @@
                 <w:sz w:val="20"/>
                 <w:szCs w:val="20"/>
               </w:rPr>
-              <w:t>Order appears under My Account → To pay.</w:t>
+              <w:t>Primo replies with matching product cards; the off-topic question gets a short store-only reply.</w:t>
             </w:r>
           </w:p>
         </w:tc>
@@ -2646,88 +2678,91 @@
         <w:tc>
           <w:tcPr>
             <w:tcW w:w="1900" w:type="dxa"/>
-            <w:tcMar>
-              <w:top w:w="80" w:type="dxa"/>
-              <w:left w:w="120" w:type="dxa"/>
-              <w:bottom w:w="80" w:type="dxa"/>
-              <w:right w:w="120" w:type="dxa"/>
-            </w:tcMar>
-            <w:vAlign w:val="center"/>
-          </w:tcPr>
-          <w:p>
-            <w:pPr>
-              <w:spacing w:after="20"/>
+            <w:shd w:val="clear" w:color="auto" w:fill="F8FBF5"/>
+            <w:tcMar>
+              <w:top w:w="80" w:type="dxa"/>
+              <w:left w:w="120" w:type="dxa"/>
+              <w:bottom w:w="80" w:type="dxa"/>
+              <w:right w:w="120" w:type="dxa"/>
+            </w:tcMar>
+            <w:vAlign w:val="center"/>
+          </w:tcPr>
+          <w:p>
+            <w:pPr>
+              <w:spacing w:after="20"/>
+            </w:pPr>
+            <w:r>
+              <w:rPr>
+                <w:sz w:val="20"/>
+                <w:szCs w:val="20"/>
+              </w:rPr>
+              <w:t>Client</w:t>
+            </w:r>
+          </w:p>
+        </w:tc>
+        <w:tc>
+          <w:tcPr>
+            <w:tcW w:w="4300" w:type="dxa"/>
+            <w:shd w:val="clear" w:color="auto" w:fill="F8FBF5"/>
+            <w:tcMar>
+              <w:top w:w="80" w:type="dxa"/>
+              <w:left w:w="120" w:type="dxa"/>
+              <w:bottom w:w="80" w:type="dxa"/>
+              <w:right w:w="120" w:type="dxa"/>
+            </w:tcMar>
+            <w:vAlign w:val="center"/>
+          </w:tcPr>
+          <w:p>
+            <w:pPr>
+              <w:spacing w:after="20"/>
+            </w:pPr>
+            <w:r>
+              <w:rPr>
+                <w:sz w:val="20"/>
+                <w:szCs w:val="20"/>
+              </w:rPr>
+              <w:t xml:space="preserve">In </w:t>
+            </w:r>
+            <w:r>
               <w:rPr>
                 <w:b/>
                 <w:bCs/>
                 <w:sz w:val="20"/>
                 <w:szCs w:val="20"/>
               </w:rPr>
-            </w:pPr>
-            <w:r>
-              <w:rPr>
-                <w:b/>
-                <w:bCs/>
-                <w:sz w:val="20"/>
-                <w:szCs w:val="20"/>
-              </w:rPr>
-              <w:t>Staffs (except Cashier)</w:t>
-            </w:r>
-          </w:p>
-        </w:tc>
-        <w:tc>
-          <w:tcPr>
-            <w:tcW w:w="4300" w:type="dxa"/>
-            <w:tcMar>
-              <w:top w:w="80" w:type="dxa"/>
-              <w:left w:w="120" w:type="dxa"/>
-              <w:bottom w:w="80" w:type="dxa"/>
-              <w:right w:w="120" w:type="dxa"/>
-            </w:tcMar>
-            <w:vAlign w:val="center"/>
-          </w:tcPr>
-          <w:p>
-            <w:pPr>
-              <w:spacing w:after="20"/>
-              <w:rPr>
-                <w:sz w:val="20"/>
-                <w:szCs w:val="20"/>
-              </w:rPr>
-            </w:pPr>
-            <w:r>
-              <w:rPr>
-                <w:sz w:val="20"/>
-                <w:szCs w:val="20"/>
-              </w:rPr>
-              <w:t>Message among staffs and send files/reports.</w:t>
+              <w:t>Build a PC</w:t>
+            </w:r>
+            <w:r>
+              <w:rPr>
+                <w:sz w:val="20"/>
+                <w:szCs w:val="20"/>
+              </w:rPr>
+              <w:t>, pick a processor and motherboard.</w:t>
             </w:r>
           </w:p>
         </w:tc>
         <w:tc>
           <w:tcPr>
             <w:tcW w:w="3880" w:type="dxa"/>
-            <w:tcMar>
-              <w:top w:w="80" w:type="dxa"/>
-              <w:left w:w="120" w:type="dxa"/>
-              <w:bottom w:w="80" w:type="dxa"/>
-              <w:right w:w="120" w:type="dxa"/>
-            </w:tcMar>
-            <w:vAlign w:val="center"/>
-          </w:tcPr>
-          <w:p>
-            <w:pPr>
-              <w:spacing w:after="20"/>
-              <w:rPr>
-                <w:sz w:val="20"/>
-                <w:szCs w:val="20"/>
-              </w:rPr>
-            </w:pPr>
-            <w:r>
-              <w:rPr>
-                <w:sz w:val="20"/>
-                <w:szCs w:val="20"/>
-              </w:rPr>
-              <w:t>Real-time conversation and reports.</w:t>
+            <w:shd w:val="clear" w:color="auto" w:fill="F8FBF5"/>
+            <w:tcMar>
+              <w:top w:w="80" w:type="dxa"/>
+              <w:left w:w="120" w:type="dxa"/>
+              <w:bottom w:w="80" w:type="dxa"/>
+              <w:right w:w="120" w:type="dxa"/>
+            </w:tcMar>
+            <w:vAlign w:val="center"/>
+          </w:tcPr>
+          <w:p>
+            <w:pPr>
+              <w:spacing w:after="20"/>
+            </w:pPr>
+            <w:r>
+              <w:rPr>
+                <w:sz w:val="20"/>
+                <w:szCs w:val="20"/>
+              </w:rPr>
+              <w:t>Compatibility, build score and total update.</w:t>
             </w:r>
           </w:p>
         </w:tc>
@@ -2739,6 +2774,83 @@
         <w:tc>
           <w:tcPr>
             <w:tcW w:w="1900" w:type="dxa"/>
+            <w:tcMar>
+              <w:top w:w="80" w:type="dxa"/>
+              <w:left w:w="120" w:type="dxa"/>
+              <w:bottom w:w="80" w:type="dxa"/>
+              <w:right w:w="120" w:type="dxa"/>
+            </w:tcMar>
+            <w:vAlign w:val="center"/>
+          </w:tcPr>
+          <w:p>
+            <w:pPr>
+              <w:spacing w:after="20"/>
+            </w:pPr>
+            <w:r>
+              <w:rPr>
+                <w:sz w:val="20"/>
+                <w:szCs w:val="20"/>
+              </w:rPr>
+              <w:t>Client</w:t>
+            </w:r>
+          </w:p>
+        </w:tc>
+        <w:tc>
+          <w:tcPr>
+            <w:tcW w:w="4300" w:type="dxa"/>
+            <w:tcMar>
+              <w:top w:w="80" w:type="dxa"/>
+              <w:left w:w="120" w:type="dxa"/>
+              <w:bottom w:w="80" w:type="dxa"/>
+              <w:right w:w="120" w:type="dxa"/>
+            </w:tcMar>
+            <w:vAlign w:val="center"/>
+          </w:tcPr>
+          <w:p>
+            <w:pPr>
+              <w:spacing w:after="20"/>
+            </w:pPr>
+            <w:r>
+              <w:rPr>
+                <w:sz w:val="20"/>
+                <w:szCs w:val="20"/>
+              </w:rPr>
+              <w:t>Add an item to the cart and check out (Pick Up).</w:t>
+            </w:r>
+          </w:p>
+        </w:tc>
+        <w:tc>
+          <w:tcPr>
+            <w:tcW w:w="3880" w:type="dxa"/>
+            <w:tcMar>
+              <w:top w:w="80" w:type="dxa"/>
+              <w:left w:w="120" w:type="dxa"/>
+              <w:bottom w:w="80" w:type="dxa"/>
+              <w:right w:w="120" w:type="dxa"/>
+            </w:tcMar>
+            <w:vAlign w:val="center"/>
+          </w:tcPr>
+          <w:p>
+            <w:pPr>
+              <w:spacing w:after="20"/>
+            </w:pPr>
+            <w:r>
+              <w:rPr>
+                <w:sz w:val="20"/>
+                <w:szCs w:val="20"/>
+              </w:rPr>
+              <w:t>Order appears under My Account → To pay.</w:t>
+            </w:r>
+          </w:p>
+        </w:tc>
+      </w:tr>
+      <w:tr>
+        <w:trPr>
+          <w:cantSplit/>
+        </w:trPr>
+        <w:tc>
+          <w:tcPr>
+            <w:tcW w:w="1900" w:type="dxa"/>
             <w:shd w:val="clear" w:color="auto" w:fill="F8FBF5"/>
             <w:tcMar>
               <w:top w:w="80" w:type="dxa"/>
@@ -2752,6 +2864,38 @@
             <w:pPr>
               <w:spacing w:after="20"/>
             </w:pPr>
+            <w:r>
+              <w:rPr>
+                <w:sz w:val="20"/>
+                <w:szCs w:val="20"/>
+              </w:rPr>
+              <w:t>Client</w:t>
+            </w:r>
+          </w:p>
+        </w:tc>
+        <w:tc>
+          <w:tcPr>
+            <w:tcW w:w="4300" w:type="dxa"/>
+            <w:shd w:val="clear" w:color="auto" w:fill="F8FBF5"/>
+            <w:tcMar>
+              <w:top w:w="80" w:type="dxa"/>
+              <w:left w:w="120" w:type="dxa"/>
+              <w:bottom w:w="80" w:type="dxa"/>
+              <w:right w:w="120" w:type="dxa"/>
+            </w:tcMar>
+            <w:vAlign w:val="center"/>
+          </w:tcPr>
+          <w:p>
+            <w:pPr>
+              <w:spacing w:after="20"/>
+            </w:pPr>
+            <w:r>
+              <w:rPr>
+                <w:sz w:val="20"/>
+                <w:szCs w:val="20"/>
+              </w:rPr>
+              <w:t xml:space="preserve">When an order is completed, open </w:t>
+            </w:r>
             <w:r>
               <w:rPr>
                 <w:b/>
@@ -2759,6 +2903,177 @@
                 <w:sz w:val="20"/>
                 <w:szCs w:val="20"/>
               </w:rPr>
+              <w:t>My Account → Order History</w:t>
+            </w:r>
+            <w:r>
+              <w:rPr>
+                <w:sz w:val="20"/>
+                <w:szCs w:val="20"/>
+              </w:rPr>
+              <w:t xml:space="preserve"> and click </w:t>
+            </w:r>
+            <w:r>
+              <w:rPr>
+                <w:b/>
+                <w:bCs/>
+                <w:sz w:val="20"/>
+                <w:szCs w:val="20"/>
+              </w:rPr>
+              <w:t>Your review</w:t>
+            </w:r>
+            <w:r>
+              <w:rPr>
+                <w:sz w:val="20"/>
+                <w:szCs w:val="20"/>
+              </w:rPr>
+              <w:t>.</w:t>
+            </w:r>
+          </w:p>
+        </w:tc>
+        <w:tc>
+          <w:tcPr>
+            <w:tcW w:w="3880" w:type="dxa"/>
+            <w:shd w:val="clear" w:color="auto" w:fill="F8FBF5"/>
+            <w:tcMar>
+              <w:top w:w="80" w:type="dxa"/>
+              <w:left w:w="120" w:type="dxa"/>
+              <w:bottom w:w="80" w:type="dxa"/>
+              <w:right w:w="120" w:type="dxa"/>
+            </w:tcMar>
+            <w:vAlign w:val="center"/>
+          </w:tcPr>
+          <w:p>
+            <w:pPr>
+              <w:spacing w:after="20"/>
+            </w:pPr>
+            <w:r>
+              <w:rPr>
+                <w:sz w:val="20"/>
+                <w:szCs w:val="20"/>
+              </w:rPr>
+              <w:t>The rating and comment show on the product page and in the custodian’s Reviews.</w:t>
+            </w:r>
+          </w:p>
+        </w:tc>
+      </w:tr>
+      <w:tr>
+        <w:trPr>
+          <w:cantSplit/>
+        </w:trPr>
+        <w:tc>
+          <w:tcPr>
+            <w:tcW w:w="1900" w:type="dxa"/>
+            <w:tcMar>
+              <w:top w:w="80" w:type="dxa"/>
+              <w:left w:w="120" w:type="dxa"/>
+              <w:bottom w:w="80" w:type="dxa"/>
+              <w:right w:w="120" w:type="dxa"/>
+            </w:tcMar>
+            <w:vAlign w:val="center"/>
+          </w:tcPr>
+          <w:p>
+            <w:pPr>
+              <w:spacing w:after="20"/>
+            </w:pPr>
+            <w:r>
+              <w:rPr>
+                <w:sz w:val="20"/>
+                <w:szCs w:val="20"/>
+              </w:rPr>
+              <w:t>Staff (except Cashier)</w:t>
+            </w:r>
+          </w:p>
+        </w:tc>
+        <w:tc>
+          <w:tcPr>
+            <w:tcW w:w="4300" w:type="dxa"/>
+            <w:tcMar>
+              <w:top w:w="80" w:type="dxa"/>
+              <w:left w:w="120" w:type="dxa"/>
+              <w:bottom w:w="80" w:type="dxa"/>
+              <w:right w:w="120" w:type="dxa"/>
+            </w:tcMar>
+            <w:vAlign w:val="center"/>
+          </w:tcPr>
+          <w:p>
+            <w:pPr>
+              <w:spacing w:after="20"/>
+            </w:pPr>
+            <w:r>
+              <w:rPr>
+                <w:sz w:val="20"/>
+                <w:szCs w:val="20"/>
+              </w:rPr>
+              <w:t xml:space="preserve">Send messages and files to another staff member in </w:t>
+            </w:r>
+            <w:r>
+              <w:rPr>
+                <w:b/>
+                <w:bCs/>
+                <w:sz w:val="20"/>
+                <w:szCs w:val="20"/>
+              </w:rPr>
+              <w:t>Messages</w:t>
+            </w:r>
+            <w:r>
+              <w:rPr>
+                <w:sz w:val="20"/>
+                <w:szCs w:val="20"/>
+              </w:rPr>
+              <w:t>.</w:t>
+            </w:r>
+          </w:p>
+        </w:tc>
+        <w:tc>
+          <w:tcPr>
+            <w:tcW w:w="3880" w:type="dxa"/>
+            <w:tcMar>
+              <w:top w:w="80" w:type="dxa"/>
+              <w:left w:w="120" w:type="dxa"/>
+              <w:bottom w:w="80" w:type="dxa"/>
+              <w:right w:w="120" w:type="dxa"/>
+            </w:tcMar>
+            <w:vAlign w:val="center"/>
+          </w:tcPr>
+          <w:p>
+            <w:pPr>
+              <w:spacing w:after="20"/>
+            </w:pPr>
+            <w:r>
+              <w:rPr>
+                <w:sz w:val="20"/>
+                <w:szCs w:val="20"/>
+              </w:rPr>
+              <w:t>Messages arrive in real time; older messages load as you scroll up.</w:t>
+            </w:r>
+          </w:p>
+        </w:tc>
+      </w:tr>
+      <w:tr>
+        <w:trPr>
+          <w:cantSplit/>
+        </w:trPr>
+        <w:tc>
+          <w:tcPr>
+            <w:tcW w:w="1900" w:type="dxa"/>
+            <w:shd w:val="clear" w:color="auto" w:fill="F8FBF5"/>
+            <w:tcMar>
+              <w:top w:w="80" w:type="dxa"/>
+              <w:left w:w="120" w:type="dxa"/>
+              <w:bottom w:w="80" w:type="dxa"/>
+              <w:right w:w="120" w:type="dxa"/>
+            </w:tcMar>
+            <w:vAlign w:val="center"/>
+          </w:tcPr>
+          <w:p>
+            <w:pPr>
+              <w:spacing w:after="20"/>
+            </w:pPr>
+            <w:r>
+              <w:rPr>
+                <w:sz w:val="20"/>
+                <w:szCs w:val="20"/>
+              </w:rPr>
               <w:t>Any role</w:t>
             </w:r>
           </w:p>
@@ -2784,23 +3099,7 @@
                 <w:sz w:val="20"/>
                 <w:szCs w:val="20"/>
               </w:rPr>
-              <w:t xml:space="preserve">Stay idle for 15 </w:t>
-            </w:r>
-            <w:proofErr w:type="gramStart"/>
-            <w:r>
-              <w:rPr>
-                <w:sz w:val="20"/>
-                <w:szCs w:val="20"/>
-              </w:rPr>
-              <w:t>minutes, or</w:t>
-            </w:r>
-            <w:proofErr w:type="gramEnd"/>
-            <w:r>
-              <w:rPr>
-                <w:sz w:val="20"/>
-                <w:szCs w:val="20"/>
-              </w:rPr>
-              <w:t xml:space="preserve"> open another role’s page.</w:t>
+              <w:t>Stay idle for 15 minutes, or open another role’s page.</w:t>
             </w:r>
           </w:p>
         </w:tc>
@@ -3036,23 +3335,7 @@
                 <w:sz w:val="20"/>
                 <w:szCs w:val="20"/>
               </w:rPr>
-              <w:t xml:space="preserve">Features are complete and </w:t>
-            </w:r>
-            <w:proofErr w:type="gramStart"/>
-            <w:r>
-              <w:rPr>
-                <w:sz w:val="20"/>
-                <w:szCs w:val="20"/>
-              </w:rPr>
-              <w:t>correct:</w:t>
-            </w:r>
-            <w:proofErr w:type="gramEnd"/>
-            <w:r>
-              <w:rPr>
-                <w:sz w:val="20"/>
-                <w:szCs w:val="20"/>
-              </w:rPr>
-              <w:t xml:space="preserve"> stock, POS, orders, forecasts, Build a PC, Primo.</w:t>
+              <w:t>Features are complete and correct: stock, POS, orders, forecasts, reports, Build a PC, Primo, reviews.</w:t>
             </w:r>
           </w:p>
         </w:tc>
@@ -3332,7 +3615,7 @@
                 <w:sz w:val="20"/>
                 <w:szCs w:val="20"/>
               </w:rPr>
-              <w:t>Role-based access, login lockout, password rules, session timeout, audit logs.</w:t>
+              <w:t>Role-based access, login lockout, password rules, session timeout, CSRF protection, audit logs.</w:t>
             </w:r>
           </w:p>
         </w:tc>
@@ -3573,58 +3856,6 @@
       </w:r>
       <w:r>
         <w:t xml:space="preserve"> placeholder for this project. No real money is charged.</w:t>
-      </w:r>
-    </w:p>
-    <w:p>
-      <w:pPr>
-        <w:pStyle w:val="ListParagraph"/>
-        <w:numPr>
-          <w:ilvl w:val="0"/>
-          <w:numId w:val="3"/>
-        </w:numPr>
-        <w:spacing w:after="40" w:line="264" w:lineRule="auto"/>
-      </w:pPr>
-      <w:r>
-        <w:t xml:space="preserve">Recommended: latest </w:t>
-      </w:r>
-      <w:r>
-        <w:rPr>
-          <w:b/>
-          <w:bCs/>
-        </w:rPr>
-        <w:t>Google Chrome</w:t>
-      </w:r>
-      <w:r>
-        <w:t xml:space="preserve"> or </w:t>
-      </w:r>
-      <w:r>
-        <w:rPr>
-          <w:b/>
-          <w:bCs/>
-        </w:rPr>
-        <w:t>Microsoft Edge</w:t>
-      </w:r>
-      <w:r>
-        <w:t xml:space="preserve"> on a desktop or laptop.</w:t>
-      </w:r>
-    </w:p>
-    <w:p>
-      <w:pPr>
-        <w:spacing w:after="200"/>
-      </w:pPr>
-    </w:p>
-    <w:p>
-      <w:pPr>
-        <w:spacing w:after="100" w:line="276" w:lineRule="auto"/>
-        <w:jc w:val="center"/>
-      </w:pPr>
-      <w:r>
-        <w:rPr>
-          <w:color w:val="5A5A5A"/>
-          <w:sz w:val="19"/>
-          <w:szCs w:val="19"/>
-        </w:rPr>
-        <w:t>Researchers: [Insert names]</w:t>
       </w:r>
     </w:p>
     <w:sectPr>
@@ -3680,25 +3911,7 @@
         <w:sz w:val="16"/>
         <w:szCs w:val="16"/>
       </w:rPr>
-      <w:t xml:space="preserve"> AI © </w:t>
-    </w:r>
-    <w:proofErr w:type="gramStart"/>
-    <w:r>
-      <w:rPr>
-        <w:color w:val="8A8A8A"/>
-        <w:sz w:val="16"/>
-        <w:szCs w:val="16"/>
-      </w:rPr>
-      <w:t>2026  |</w:t>
-    </w:r>
-    <w:proofErr w:type="gramEnd"/>
-    <w:r>
-      <w:rPr>
-        <w:color w:val="8A8A8A"/>
-        <w:sz w:val="16"/>
-        <w:szCs w:val="16"/>
-      </w:rPr>
-      <w:t xml:space="preserve">  </w:t>
+      <w:t xml:space="preserve"> AI © 2026  |  </w:t>
     </w:r>
     <w:proofErr w:type="spellStart"/>
     <w:r>
@@ -3716,25 +3929,7 @@
         <w:sz w:val="16"/>
         <w:szCs w:val="16"/>
       </w:rPr>
-      <w:t xml:space="preserve"> One Oasis Branch, Rosario, Pasig </w:t>
-    </w:r>
-    <w:proofErr w:type="gramStart"/>
-    <w:r>
-      <w:rPr>
-        <w:color w:val="8A8A8A"/>
-        <w:sz w:val="16"/>
-        <w:szCs w:val="16"/>
-      </w:rPr>
-      <w:t>City  |</w:t>
-    </w:r>
-    <w:proofErr w:type="gramEnd"/>
-    <w:r>
-      <w:rPr>
-        <w:color w:val="8A8A8A"/>
-        <w:sz w:val="16"/>
-        <w:szCs w:val="16"/>
-      </w:rPr>
-      <w:t xml:space="preserve">  Page </w:t>
+      <w:t xml:space="preserve"> One Oasis Branch, Rosario, Pasig City  |  Page </w:t>
     </w:r>
     <w:r>
       <w:rPr>

</xml_diff>